<commit_message>
Taller para padres 8-11 "El plan bilingue: del colegio a la universidad" (guion 5 partes: dolor, vivencial, mapa honesto, 5 preguntas anti-competencia, cierre de sala con captura) + School Partner ampliado a 8-11 con RUTA SABATINA (A1 en 8, A2 en 9, B1 en 10 -> gap = B2+graduacion; nino de 8vo = 3-4 anos de ruta)
Co-Authored-By: Claude Fable 5 <noreply@anthropic.com>
Claude-Session: https://claude.ai/code/session_018H7C5dx3NvDfXiv3CfhPMa
</commit_message>
<xml_diff>
--- a/recursos/comercial/B2B/CARTA_SCHOOL_PARTNER_v1.docx
+++ b/recursos/comercial/B2B/CARTA_SCHOOL_PARTNER_v1.docx
@@ -63,7 +63,7 @@
           <w:b/>
           <w:sz w:val="23"/>
         </w:rPr>
-        <w:t>Asunto: Alianza Heiiu School Partner — una experiencia real para su grado 11</w:t>
+        <w:t>Asunto: Alianza Heiiu School Partner — el plan bilingüe para sus estudiantes de 8° a 11°</w:t>
       </w:r>
     </w:p>
     <w:p>
@@ -75,7 +75,7 @@
           <w:b w:val="0"/>
           <w:sz w:val="23"/>
         </w:rPr>
-        <w:t>En Heiiu English Academy formamos estudiantes que buscan convertirse en la mejor versión de sí mismos aprendiendo inglés. Queremos invitar a [Nombre del colegio] a convertirse en Heiiu School Partner dentro de nuestra iniciativa Go Above and Beyond — una alianza sin ningún costo para el colegio, diseñada para el momento más importante de sus estudiantes de grado 11: decidir qué sigue después del grado.</w:t>
+        <w:t>En Heiiu English Academy formamos estudiantes que buscan convertirse en la mejor versión de sí mismos aprendiendo inglés. Queremos invitar a [Nombre del colegio] a convertirse en Heiiu School Partner dentro de nuestra iniciativa Go Above and Beyond — una alianza sin ningún costo para el colegio, diseñada para sus estudiantes de 8° a 11°: desde la ruta bilingüe de los sábados (que no toca la jornada escolar) hasta la decisión más importante del grado 11 — qué sigue después del grado.</w:t>
       </w:r>
     </w:p>
     <w:p>
@@ -87,7 +87,7 @@
           <w:b w:val="0"/>
           <w:sz w:val="23"/>
         </w:rPr>
-        <w:t>La alianza incluye: (1) la HEIIU EXPERIENCE CLASS — no una charla: una clase real de inglés inmersivo de 45 minutos para su grado 11, en su colegio o en nuestra sede, donde sus estudiantes viven una simulación profesional hablando de pie desde el primer minuto; (2) el PREMIO HEIIU — una beca anual que su colegio entrega en su ceremonia de grado al estudiante más destacado en inglés, como reconocimiento del colegio a la excelencia; (3) una charla para padres de grado 11 — "el semestre que no se pierde": cómo convertir los meses entre el grado y la universidad en un nivel de inglés certificado, con garantía de aprendizaje por escrito; y (4) condiciones preferenciales de pago para sus egresados.</w:t>
+        <w:t>La alianza incluye: (1) la HEIIU EXPERIENCE CLASS — no una charla: una clase real de inglés inmersivo de 45 minutos para su grado 11, en su colegio o en nuestra sede, donde sus estudiantes viven una simulación profesional hablando de pie desde el primer minuto; (2) el PREMIO HEIIU — una beca anual que su colegio entrega en su ceremonia de grado al estudiante más destacado en inglés, como reconocimiento del colegio a la excelencia; (3) el TALLER PARA PADRES de 8° a 11° — "el semestre que no se pierde": cómo convertir los meses entre el grado y la universidad en un nivel de inglés certificado, con garantía de aprendizaje por escrito; y (4) la ruta sabatina para 8°-10° (un nivel por año, los sábados, sin tocar la jornada escolar — el estudiante llega a grado 11 con nivel B1); y (5) condiciones preferenciales de pago para sus estudiantes y egresados.</w:t>
       </w:r>
     </w:p>
     <w:p>

</xml_diff>